<commit_message>
sync: dzienny update 2026-04-10 [auto]
</commit_message>
<xml_diff>
--- a/20_AREAS/AREA_Customers/_PROSPECTS/COP_Kartoszyno/Oferta_COP_Kartoszyno_2026-04_v2.docx
+++ b/20_AREAS/AREA_Customers/_PROSPECTS/COP_Kartoszyno/Oferta_COP_Kartoszyno_2026-04_v2.docx
@@ -163,7 +163,7 @@
         <w:pStyle w:val="ListBullet"/>
       </w:pPr>
       <w:r>
-        <w:t>Brak widoku "z lotu ptaka" — ile pokoi wolnych jutro? Za tydzień? Za miesiąc?</w:t>
+        <w:t>Brak widoku „z lotu ptaka” — ile pokoi wolnych jutro? Za tydzień? Za miesiąc?</w:t>
       </w:r>
     </w:p>
     <w:p>
@@ -192,7 +192,7 @@
     </w:p>
     <w:p>
       <w:r>
-        <w:t>Budujemy dedykowaną aplikację webową — nie "kolejny SaaS z abonamentem", tylko Wasz system, na Waszym serwerze, pod Waszą kontrolą.</w:t>
+        <w:t>Budujemy dedykowaną aplikację webową — nie „kolejny SaaS z abonamentem”, tylko Wasz system, na Waszym serwerze, pod Waszą kontrolą.</w:t>
       </w:r>
     </w:p>
     <w:p>
@@ -754,43 +754,6 @@
     </w:p>
     <w:p>
       <w:pPr>
-        <w:spacing w:before="120" w:after="120"/>
-      </w:pPr>
-    </w:p>
-    <w:p>
-      <w:pPr>
-        <w:pStyle w:val="Heading2"/>
-      </w:pPr>
-      <w:r>
-        <w:rPr>
-          <w:color w:val="1E293B"/>
-        </w:rPr>
-        <w:t>Moduły premium — pakiet zaawansowany</w:t>
-      </w:r>
-    </w:p>
-    <w:p>
-      <w:r>
-        <w:t>Dodatkowe funkcjonalności, które wyróżniają system na tle konkurencji.</w:t>
-      </w:r>
-    </w:p>
-    <w:p>
-      <w:pPr>
-        <w:pStyle w:val="Heading3"/>
-      </w:pPr>
-      <w:r>
-        <w:rPr>
-          <w:color w:val="1E293B"/>
-        </w:rPr>
-        <w:t>3 role z uprawnieniami</w:t>
-      </w:r>
-    </w:p>
-    <w:p>
-      <w:r>
-        <w:t>Zarząd (pełen dostęp z finansami), Recepcja (obsługa bieżąca bez cen i stawek), Koordynator firmy (zgłasza usterki, widzi swoje pokoje). Każda rola widzi tylko to co powinna.</w:t>
-      </w:r>
-    </w:p>
-    <w:p>
-      <w:pPr>
         <w:pStyle w:val="Heading3"/>
       </w:pPr>
       <w:r>
@@ -933,12 +896,65 @@
         <w:rPr>
           <w:color w:val="1E293B"/>
         </w:rPr>
+        <w:t>Wersja mobilna — tablet i telefon</w:t>
+      </w:r>
+    </w:p>
+    <w:p>
+      <w:r>
+        <w:t>Cały system zaprojektowany mobile-first. Dolna nawigacja na telefonie, responsywne karty zamiast tabel. Koordynatorzy w terenie mogą zgłosić usterkę ze zdjęciem w 30 sekund.</w:t>
+      </w:r>
+    </w:p>
+    <w:p>
+      <w:pPr>
+        <w:pStyle w:val="Heading3"/>
+      </w:pPr>
+      <w:r>
+        <w:rPr>
+          <w:color w:val="1E293B"/>
+        </w:rPr>
         <w:t>System usterek ze zdjęciami i filmami</w:t>
       </w:r>
     </w:p>
     <w:p>
       <w:r>
         <w:t>Dwa typy usterek: eksploatacyjna i dewastacyjna. Zgłoszenia ze zdjęciami i filmami prosto z telefonu. Kaskadowy wybór: budynek → moduł → lokal → pokój. Statusy: zgłoszona → w trakcie → naprawiona. Badge z liczbą otwartych usterek w menu.</w:t>
+      </w:r>
+    </w:p>
+    <w:p>
+      <w:pPr>
+        <w:spacing w:before="120" w:after="120"/>
+      </w:pPr>
+    </w:p>
+    <w:p>
+      <w:pPr>
+        <w:pStyle w:val="Heading2"/>
+      </w:pPr>
+      <w:r>
+        <w:rPr>
+          <w:color w:val="1E293B"/>
+        </w:rPr>
+        <w:t>Moduły premium — pakiet zaawansowany</w:t>
+      </w:r>
+    </w:p>
+    <w:p>
+      <w:r>
+        <w:t>Dodatkowe funkcjonalności, które wyróżniają system na tle konkurencji.</w:t>
+      </w:r>
+    </w:p>
+    <w:p>
+      <w:pPr>
+        <w:pStyle w:val="Heading3"/>
+      </w:pPr>
+      <w:r>
+        <w:rPr>
+          <w:color w:val="1E293B"/>
+        </w:rPr>
+        <w:t>3 role z uprawnieniami</w:t>
+      </w:r>
+    </w:p>
+    <w:p>
+      <w:r>
+        <w:t>Zarząd (pełen dostęp z finansami), Recepcja (obsługa bieżąca bez cen i stawek), Koordynator firmy (zgłasza usterki, widzi swoje pokoje). Każda rola widzi tylko to co powinna.</w:t>
       </w:r>
     </w:p>
     <w:p>
@@ -954,23 +970,7 @@
     </w:p>
     <w:p>
       <w:r>
-        <w:t>Dedykowany panel dla koordynatorów firm. "Moje pokoje" z rezerwacjami. "Zgłoś usterkę" — prosty formularz ze zdjęciami/filmami z telefonu. Koordynator widzi tylko dane swojej firmy. Loguje się własnym kontem.</w:t>
-      </w:r>
-    </w:p>
-    <w:p>
-      <w:pPr>
-        <w:pStyle w:val="Heading3"/>
-      </w:pPr>
-      <w:r>
-        <w:rPr>
-          <w:color w:val="1E293B"/>
-        </w:rPr>
-        <w:t>Wersja mobilna — tablet i telefon</w:t>
-      </w:r>
-    </w:p>
-    <w:p>
-      <w:r>
-        <w:t>Cały system zaprojektowany mobile-first. Dolna nawigacja na telefonie, responsywne karty zamiast tabel. Koordynatorzy w terenie mogą zgłosić usterkę ze zdjęciem w 30 sekund.</w:t>
+        <w:t>Dedykowany panel dla koordynatorów firm. „Moje pokoje” z rezerwacjami. „Zgłoś usterkę” — prosty formularz ze zdjęciami/filmami z telefonu. Koordynator widzi tylko dane swojej firmy. Loguje się własnym kontem.</w:t>
       </w:r>
     </w:p>
     <w:p>
@@ -979,16 +979,11 @@
       </w:pPr>
     </w:p>
     <w:p>
-      <w:pPr>
-        <w:pStyle w:val="Heading1"/>
-      </w:pPr>
       <w:r>
-        <w:rPr>
-          <w:color w:val="1E293B"/>
-        </w:rPr>
-        <w:t>Inwestycja</w:t>
+        <w:t>Dwa pakiety do wyboru:</w:t>
       </w:r>
     </w:p>
+    <w:p/>
     <w:tbl>
       <w:tblPr>
         <w:tblStyle w:val="LightGrid-Accent1"/>
@@ -1320,10 +1315,121 @@
           </w:tcPr>
           <w:p>
             <w:r>
-              <w:rPr>
-                <w:b/>
-              </w:rPr>
-              <w:t>3 role (Zarząd / Recepcja / Koordynator)</w:t>
+              <w:t>Rozliczenie miesięczne do faktur</w:t>
+            </w:r>
+          </w:p>
+        </w:tc>
+        <w:tc>
+          <w:tcPr>
+            <w:tcW w:type="dxa" w:w="3135"/>
+          </w:tcPr>
+          <w:p>
+            <w:pPr>
+              <w:jc w:val="center"/>
+            </w:pPr>
+            <w:r>
+              <w:t>✓</w:t>
+            </w:r>
+          </w:p>
+        </w:tc>
+        <w:tc>
+          <w:tcPr>
+            <w:tcW w:type="dxa" w:w="3135"/>
+          </w:tcPr>
+          <w:p>
+            <w:pPr>
+              <w:jc w:val="center"/>
+            </w:pPr>
+            <w:r>
+              <w:t>✓</w:t>
+            </w:r>
+          </w:p>
+        </w:tc>
+      </w:tr>
+      <w:tr>
+        <w:tc>
+          <w:tcPr>
+            <w:tcW w:type="dxa" w:w="3135"/>
+          </w:tcPr>
+          <w:p>
+            <w:r>
+              <w:t>Wersja mobilna (tablet + telefon)</w:t>
+            </w:r>
+          </w:p>
+        </w:tc>
+        <w:tc>
+          <w:tcPr>
+            <w:tcW w:type="dxa" w:w="3135"/>
+          </w:tcPr>
+          <w:p>
+            <w:pPr>
+              <w:jc w:val="center"/>
+            </w:pPr>
+            <w:r>
+              <w:t>✓</w:t>
+            </w:r>
+          </w:p>
+        </w:tc>
+        <w:tc>
+          <w:tcPr>
+            <w:tcW w:type="dxa" w:w="3135"/>
+          </w:tcPr>
+          <w:p>
+            <w:pPr>
+              <w:jc w:val="center"/>
+            </w:pPr>
+            <w:r>
+              <w:t>✓</w:t>
+            </w:r>
+          </w:p>
+        </w:tc>
+      </w:tr>
+      <w:tr>
+        <w:tc>
+          <w:tcPr>
+            <w:tcW w:type="dxa" w:w="3135"/>
+          </w:tcPr>
+          <w:p>
+            <w:r>
+              <w:t>System usterek ze zdjęciami</w:t>
+            </w:r>
+          </w:p>
+        </w:tc>
+        <w:tc>
+          <w:tcPr>
+            <w:tcW w:type="dxa" w:w="3135"/>
+          </w:tcPr>
+          <w:p>
+            <w:pPr>
+              <w:jc w:val="center"/>
+            </w:pPr>
+            <w:r>
+              <w:t>✓</w:t>
+            </w:r>
+          </w:p>
+        </w:tc>
+        <w:tc>
+          <w:tcPr>
+            <w:tcW w:type="dxa" w:w="3135"/>
+          </w:tcPr>
+          <w:p>
+            <w:pPr>
+              <w:jc w:val="center"/>
+            </w:pPr>
+            <w:r>
+              <w:t>✓</w:t>
+            </w:r>
+          </w:p>
+        </w:tc>
+      </w:tr>
+      <w:tr>
+        <w:tc>
+          <w:tcPr>
+            <w:tcW w:type="dxa" w:w="3135"/>
+          </w:tcPr>
+          <w:p>
+            <w:r>
+              <w:t>System usterek z filmami</w:t>
             </w:r>
           </w:p>
         </w:tc>
@@ -1361,91 +1467,6 @@
           </w:tcPr>
           <w:p>
             <w:r>
-              <w:rPr>
-                <w:b/>
-              </w:rPr>
-              <w:t>Rozliczenie miesięczne do faktur</w:t>
-            </w:r>
-          </w:p>
-        </w:tc>
-        <w:tc>
-          <w:tcPr>
-            <w:tcW w:type="dxa" w:w="3135"/>
-          </w:tcPr>
-          <w:p>
-            <w:pPr>
-              <w:jc w:val="center"/>
-            </w:pPr>
-            <w:r>
-              <w:t>—</w:t>
-            </w:r>
-          </w:p>
-        </w:tc>
-        <w:tc>
-          <w:tcPr>
-            <w:tcW w:type="dxa" w:w="3135"/>
-          </w:tcPr>
-          <w:p>
-            <w:pPr>
-              <w:jc w:val="center"/>
-            </w:pPr>
-            <w:r>
-              <w:t>✓</w:t>
-            </w:r>
-          </w:p>
-        </w:tc>
-      </w:tr>
-      <w:tr>
-        <w:tc>
-          <w:tcPr>
-            <w:tcW w:type="dxa" w:w="3135"/>
-          </w:tcPr>
-          <w:p>
-            <w:r>
-              <w:rPr>
-                <w:b/>
-              </w:rPr>
-              <w:t>System usterek ze zdjęciami i filmami</w:t>
-            </w:r>
-          </w:p>
-        </w:tc>
-        <w:tc>
-          <w:tcPr>
-            <w:tcW w:type="dxa" w:w="3135"/>
-          </w:tcPr>
-          <w:p>
-            <w:pPr>
-              <w:jc w:val="center"/>
-            </w:pPr>
-            <w:r>
-              <w:t>—</w:t>
-            </w:r>
-          </w:p>
-        </w:tc>
-        <w:tc>
-          <w:tcPr>
-            <w:tcW w:type="dxa" w:w="3135"/>
-          </w:tcPr>
-          <w:p>
-            <w:pPr>
-              <w:jc w:val="center"/>
-            </w:pPr>
-            <w:r>
-              <w:t>✓</w:t>
-            </w:r>
-          </w:p>
-        </w:tc>
-      </w:tr>
-      <w:tr>
-        <w:tc>
-          <w:tcPr>
-            <w:tcW w:type="dxa" w:w="3135"/>
-          </w:tcPr>
-          <w:p>
-            <w:r>
-              <w:rPr>
-                <w:b/>
-              </w:rPr>
               <w:t>Portal Koordynatora firmy</w:t>
             </w:r>
           </w:p>
@@ -1484,10 +1505,7 @@
           </w:tcPr>
           <w:p>
             <w:r>
-              <w:rPr>
-                <w:b/>
-              </w:rPr>
-              <w:t>Wersja mobilna (tablet + telefon)</w:t>
+              <w:t>3 role (Zarząd / Recepcja / Koordynator)</w:t>
             </w:r>
           </w:p>
         </w:tc>
@@ -1545,11 +1563,9 @@
         </w:rPr>
         <w:t xml:space="preserve"> netto</w:t>
       </w:r>
-    </w:p>
-    <w:p>
-      <w:pPr>
-        <w:jc w:val="center"/>
-      </w:pPr>
+      <w:r>
+        <w:t xml:space="preserve">       </w:t>
+      </w:r>
       <w:r>
         <w:rPr>
           <w:color w:val="64748B"/>
@@ -1569,21 +1585,7 @@
           <w:color w:val="94A3B8"/>
           <w:sz w:val="20"/>
         </w:rPr>
-        <w:t xml:space="preserve"> netto + retainer 790 PLN/mies.</w:t>
-      </w:r>
-    </w:p>
-    <w:p/>
-    <w:p>
-      <w:pPr>
-        <w:jc w:val="center"/>
-      </w:pPr>
-      <w:r>
-        <w:rPr>
-          <w:i/>
-          <w:color w:val="94A3B8"/>
-          <w:sz w:val="18"/>
-        </w:rPr>
-        <w:t>Ceny netto + 23% VAT. Płatność: 50% zaliczka, 50% po go-live.</w:t>
+        <w:t xml:space="preserve"> netto</w:t>
       </w:r>
     </w:p>
     <w:p>
@@ -1599,7 +1601,65 @@
         <w:rPr>
           <w:color w:val="1E293B"/>
         </w:rPr>
-        <w:t>Dlaczego Dokodu</w:t>
+        <w:t>Dlaczego Dokodu?</w:t>
+      </w:r>
+    </w:p>
+    <w:p>
+      <w:r>
+        <w:t>Nasze podejście opiera się na partnerstwie i pełnej transparentności. Chcemy, abyście od samego początku widzieli nasze zaangażowanie i potencjał docelowego rozwiązania.</w:t>
+      </w:r>
+    </w:p>
+    <w:p>
+      <w:r>
+        <w:t xml:space="preserve">Uruchomiliśmy dla Was specjalny serwer testowy z makietą systemu. Możecie go klikać i sprawdzać podstawowe funkcje pod adresem: </w:t>
+      </w:r>
+      <w:r>
+        <w:rPr>
+          <w:b/>
+          <w:color w:val="CA8A04"/>
+        </w:rPr>
+        <w:t>https://dev.dokodu.it/wynajem</w:t>
+      </w:r>
+    </w:p>
+    <w:p>
+      <w:r>
+        <w:t>Dla pełnego wglądu w możliwości narzędzia przygotowaliśmy trzy warianty podglądu, odpowiadające różnym rolom w organizacji:</w:t>
+      </w:r>
+    </w:p>
+    <w:p>
+      <w:pPr>
+        <w:pStyle w:val="ListBullet"/>
+      </w:pPr>
+      <w:r>
+        <w:t>Przycisk „Zarząd”: pokazuje panel administratora z pełnym wglądem w finanse i statystyki obiektu.</w:t>
+      </w:r>
+    </w:p>
+    <w:p>
+      <w:pPr>
+        <w:pStyle w:val="ListBullet"/>
+      </w:pPr>
+      <w:r>
+        <w:t>Przycisk „Recepcja”: aktywuje widok operacyjny dla pracowników odpowiedzialnych za bieżącą obsługę gości i rezerwacji.</w:t>
+      </w:r>
+    </w:p>
+    <w:p>
+      <w:pPr>
+        <w:pStyle w:val="ListBullet"/>
+      </w:pPr>
+      <w:r>
+        <w:t>Przycisk „Koordynator”: prezentuje dostęp dla przedstawicieli firm zewnętrznych, pozwalający np. na zgłaszanie usterek w ich pokojach.</w:t>
+      </w:r>
+    </w:p>
+    <w:p/>
+    <w:p>
+      <w:pPr>
+        <w:pStyle w:val="Heading3"/>
+      </w:pPr>
+      <w:r>
+        <w:rPr>
+          <w:color w:val="1E293B"/>
+        </w:rPr>
+        <w:t>Ważne uwagi dotyczące wersji testowej:</w:t>
       </w:r>
     </w:p>
     <w:p>
@@ -1607,10 +1667,10 @@
         <w:rPr>
           <w:b/>
         </w:rPr>
-        <w:t xml:space="preserve">System już działa — </w:t>
+        <w:t xml:space="preserve">To nie jest produkt finalny: </w:t>
       </w:r>
       <w:r>
-        <w:t>Nie kupujecie obietnicy — widzicie gotowy system na serwerze testowym. Możecie go klikać i testować. Od podpisania do go-live: 4 tygodnie.</w:t>
+        <w:t>Prezentowane rozwiązanie ma obecnie charakter wyłącznie poglądowy i służy do zademonstrowania logiki działania systemu.</w:t>
       </w:r>
     </w:p>
     <w:p>
@@ -1618,10 +1678,10 @@
         <w:rPr>
           <w:b/>
         </w:rPr>
-        <w:t xml:space="preserve">Wasze dane, Wasz serwer — </w:t>
+        <w:t xml:space="preserve">Makiety i dane: </w:t>
       </w:r>
       <w:r>
-        <w:t>Żadnych abonamentów SaaS. Kod i dane zostają u Was.</w:t>
+        <w:t>Na tym etapie dane mogą się jeszcze nie zapisywać na stałe, a w samym działaniu makiety mogą wystąpić sporadyczne błędy.</w:t>
       </w:r>
     </w:p>
     <w:p>
@@ -1629,21 +1689,15 @@
         <w:rPr>
           <w:b/>
         </w:rPr>
-        <w:t xml:space="preserve">Znamy specyfikę noclegów pracowniczych — </w:t>
+        <w:t xml:space="preserve">Pełna personalizacja: </w:t>
       </w:r>
       <w:r>
-        <w:t>Rozliczanie za pokój, koordynatorzy firm z loginami, usterki z filmami.</w:t>
+        <w:t>Wszystkie funkcje zostaną precyzyjnie dostosowane do Waszych wymagań na podstawie wniosków z warsztatu po podpisaniu umowy.</w:t>
       </w:r>
     </w:p>
     <w:p>
       <w:r>
-        <w:rPr>
-          <w:b/>
-        </w:rPr>
-        <w:t xml:space="preserve">140+ firm, ocena 4.9/5 — </w:t>
-      </w:r>
-      <w:r>
-        <w:t>Doświadczenie w szkoleniach i wdrożeniach AI/automatyzacji dla firm.</w:t>
+        <w:t>Doceniamy dotychczasowy dialog i wierzymy, że wzajemne wsparcie pozwoli nam na szybkie i efektywne wdrożenie. Wasze unikalne potrzeby są dla nas priorytetem, a elastyczność wariantów cenowych pozwoli nam idealnie wpasować się w Wasze oczekiwania.</w:t>
       </w:r>
     </w:p>
     <w:p>
@@ -1679,12 +1733,12 @@
     </w:p>
     <w:p>
       <w:r>
-        <w:t>3. Kickoff call — potrzebuję listę budynków i pokoi</w:t>
+        <w:t>3. Kickoff call: potrzebujemy danych z listą budynków i pokoi oraz wypracować listę zmian do wprowadzenia.</w:t>
       </w:r>
     </w:p>
     <w:p>
       <w:r>
-        <w:t>4. Go-live przed sezonem (czerwiec 2026)</w:t>
+        <w:t>4. Go-live: od podpisania umowy potrzebujemy około 2 tygodni aby dostarczyć gotowe rozwiązanie.</w:t>
       </w:r>
     </w:p>
     <w:p/>

</xml_diff>